<commit_message>
AF_V2: Added video training results
</commit_message>
<xml_diff>
--- a/Research_Results_1.docx
+++ b/Research_Results_1.docx
@@ -1,6 +1,6 @@
 
 <file path=word/document.xml><?xml version="1.0" encoding="utf-8"?>
-<w:document xmlns:wpc="http://schemas.microsoft.com/office/word/2010/wordprocessingCanvas" xmlns:cx="http://schemas.microsoft.com/office/drawing/2014/chartex" xmlns:cx1="http://schemas.microsoft.com/office/drawing/2015/9/8/chartex" xmlns:cx2="http://schemas.microsoft.com/office/drawing/2015/10/21/chartex" xmlns:cx3="http://schemas.microsoft.com/office/drawing/2016/5/9/chartex" xmlns:cx4="http://schemas.microsoft.com/office/drawing/2016/5/10/chartex" xmlns:cx5="http://schemas.microsoft.com/office/drawing/2016/5/11/chartex" xmlns:cx6="http://schemas.microsoft.com/office/drawing/2016/5/12/chartex" xmlns:cx7="http://schemas.microsoft.com/office/drawing/2016/5/13/chartex" xmlns:cx8="http://schemas.microsoft.com/office/drawing/2016/5/14/chartex" xmlns:mc="http://schemas.openxmlformats.org/markup-compatibility/2006" xmlns:aink="http://schemas.microsoft.com/office/drawing/2016/ink" xmlns:am3d="http://schemas.microsoft.com/office/drawing/2017/model3d" xmlns:o="urn:schemas-microsoft-com:office:office" xmlns:oel="http://schemas.microsoft.com/office/2019/extlst" xmlns:r="http://schemas.openxmlformats.org/officeDocument/2006/relationships" xmlns:m="http://schemas.openxmlformats.org/officeDocument/2006/math" xmlns:v="urn:schemas-microsoft-com:vml" xmlns:wp14="http://schemas.microsoft.com/office/word/2010/wordprocessingDrawing" xmlns:wp="http://schemas.openxmlformats.org/drawingml/2006/wordprocessingDrawing" xmlns:w10="urn:schemas-microsoft-com:office:word" xmlns:w="http://schemas.openxmlformats.org/wordprocessingml/2006/main" xmlns:w14="http://schemas.microsoft.com/office/word/2010/wordml" xmlns:w15="http://schemas.microsoft.com/office/word/2012/wordml" xmlns:w16cex="http://schemas.microsoft.com/office/word/2018/wordml/cex" xmlns:w16cid="http://schemas.microsoft.com/office/word/2016/wordml/cid" xmlns:w16="http://schemas.microsoft.com/office/word/2018/wordml" xmlns:w16sdtdh="http://schemas.microsoft.com/office/word/2020/wordml/sdtdatahash" xmlns:w16se="http://schemas.microsoft.com/office/word/2015/wordml/symex" xmlns:wpg="http://schemas.microsoft.com/office/word/2010/wordprocessingGroup" xmlns:wpi="http://schemas.microsoft.com/office/word/2010/wordprocessingInk" xmlns:wne="http://schemas.microsoft.com/office/word/2006/wordml" xmlns:wps="http://schemas.microsoft.com/office/word/2010/wordprocessingShape" mc:Ignorable="w14 w15 w16se w16cid w16 w16cex w16sdtdh wp14">
+<w:document xmlns:wpc="http://schemas.microsoft.com/office/word/2010/wordprocessingCanvas" xmlns:cx="http://schemas.microsoft.com/office/drawing/2014/chartex" xmlns:cx1="http://schemas.microsoft.com/office/drawing/2015/9/8/chartex" xmlns:cx2="http://schemas.microsoft.com/office/drawing/2015/10/21/chartex" xmlns:cx3="http://schemas.microsoft.com/office/drawing/2016/5/9/chartex" xmlns:cx4="http://schemas.microsoft.com/office/drawing/2016/5/10/chartex" xmlns:cx5="http://schemas.microsoft.com/office/drawing/2016/5/11/chartex" xmlns:cx6="http://schemas.microsoft.com/office/drawing/2016/5/12/chartex" xmlns:cx7="http://schemas.microsoft.com/office/drawing/2016/5/13/chartex" xmlns:cx8="http://schemas.microsoft.com/office/drawing/2016/5/14/chartex" xmlns:mc="http://schemas.openxmlformats.org/markup-compatibility/2006" xmlns:aink="http://schemas.microsoft.com/office/drawing/2016/ink" xmlns:am3d="http://schemas.microsoft.com/office/drawing/2017/model3d" xmlns:o="urn:schemas-microsoft-com:office:office" xmlns:oel="http://schemas.microsoft.com/office/2019/extlst" xmlns:r="http://schemas.openxmlformats.org/officeDocument/2006/relationships" xmlns:m="http://schemas.openxmlformats.org/officeDocument/2006/math" xmlns:v="urn:schemas-microsoft-com:vml" xmlns:wp14="http://schemas.microsoft.com/office/word/2010/wordprocessingDrawing" xmlns:wp="http://schemas.openxmlformats.org/drawingml/2006/wordprocessingDrawing" xmlns:w10="urn:schemas-microsoft-com:office:word" xmlns:w="http://schemas.openxmlformats.org/wordprocessingml/2006/main" xmlns:w14="http://schemas.microsoft.com/office/word/2010/wordml" xmlns:w15="http://schemas.microsoft.com/office/word/2012/wordml" xmlns:w16cex="http://schemas.microsoft.com/office/word/2018/wordml/cex" xmlns:w16cid="http://schemas.microsoft.com/office/word/2016/wordml/cid" xmlns:w16="http://schemas.microsoft.com/office/word/2018/wordml" xmlns:w16du="http://schemas.microsoft.com/office/word/2023/wordml/word16du" xmlns:w16sdtdh="http://schemas.microsoft.com/office/word/2020/wordml/sdtdatahash" xmlns:w16sdtfl="http://schemas.microsoft.com/office/word/2024/wordml/sdtformatlock" xmlns:w16se="http://schemas.microsoft.com/office/word/2015/wordml/symex" xmlns:wpg="http://schemas.microsoft.com/office/word/2010/wordprocessingGroup" xmlns:wpi="http://schemas.microsoft.com/office/word/2010/wordprocessingInk" xmlns:wne="http://schemas.microsoft.com/office/word/2006/wordml" xmlns:wps="http://schemas.microsoft.com/office/word/2010/wordprocessingShape" mc:Ignorable="w14 w15 w16se w16cid w16 w16cex w16sdtdh w16sdtfl w16du wp14">
   <w:body>
     <w:tbl>
       <w:tblPr>
@@ -10,10 +10,10 @@
         <w:tblLook w:val="04A0" w:firstRow="1" w:lastRow="0" w:firstColumn="1" w:lastColumn="0" w:noHBand="0" w:noVBand="1"/>
       </w:tblPr>
       <w:tblGrid>
-        <w:gridCol w:w="1923"/>
-        <w:gridCol w:w="2407"/>
+        <w:gridCol w:w="1496"/>
+        <w:gridCol w:w="3122"/>
         <w:gridCol w:w="2663"/>
-        <w:gridCol w:w="2033"/>
+        <w:gridCol w:w="1745"/>
       </w:tblGrid>
       <w:tr>
         <w:trPr>
@@ -465,6 +465,147 @@
             <w:pPr>
               <w:cnfStyle w:val="000000100000" w:firstRow="0" w:lastRow="0" w:firstColumn="0" w:lastColumn="0" w:oddVBand="0" w:evenVBand="0" w:oddHBand="1" w:evenHBand="0" w:firstRowFirstColumn="0" w:firstRowLastColumn="0" w:lastRowFirstColumn="0" w:lastRowLastColumn="0"/>
             </w:pPr>
+            <w:r>
+              <w:t xml:space="preserve">accuracy: 0.1539 </w:t>
+            </w:r>
+          </w:p>
+          <w:p>
+            <w:pPr>
+              <w:cnfStyle w:val="000000100000" w:firstRow="0" w:lastRow="0" w:firstColumn="0" w:lastColumn="0" w:oddVBand="0" w:evenVBand="0" w:oddHBand="1" w:evenHBand="0" w:firstRowFirstColumn="0" w:firstRowLastColumn="0" w:lastRowFirstColumn="0" w:lastRowLastColumn="0"/>
+            </w:pPr>
+            <w:r>
+              <w:t>loss: 4.5870</w:t>
+            </w:r>
+          </w:p>
+          <w:p>
+            <w:pPr>
+              <w:cnfStyle w:val="000000100000" w:firstRow="0" w:lastRow="0" w:firstColumn="0" w:lastColumn="0" w:oddVBand="0" w:evenVBand="0" w:oddHBand="1" w:evenHBand="0" w:firstRowFirstColumn="0" w:firstRowLastColumn="0" w:lastRowFirstColumn="0" w:lastRowLastColumn="0"/>
+            </w:pPr>
+            <w:proofErr w:type="spellStart"/>
+            <w:r>
+              <w:t>val_accuracy</w:t>
+            </w:r>
+            <w:proofErr w:type="spellEnd"/>
+            <w:r>
+              <w:t xml:space="preserve">: 0.5000- </w:t>
+            </w:r>
+            <w:proofErr w:type="spellStart"/>
+            <w:r>
+              <w:t>val_loss</w:t>
+            </w:r>
+            <w:proofErr w:type="spellEnd"/>
+            <w:r>
+              <w:t>: 2.7125</w:t>
+            </w:r>
+          </w:p>
+          <w:p>
+            <w:pPr>
+              <w:cnfStyle w:val="000000100000" w:firstRow="0" w:lastRow="0" w:firstColumn="0" w:lastColumn="0" w:oddVBand="0" w:evenVBand="0" w:oddHBand="1" w:evenHBand="0" w:firstRowFirstColumn="0" w:firstRowLastColumn="0" w:lastRowFirstColumn="0" w:lastRowLastColumn="0"/>
+            </w:pPr>
+          </w:p>
+          <w:p>
+            <w:pPr>
+              <w:cnfStyle w:val="000000100000" w:firstRow="0" w:lastRow="0" w:firstColumn="0" w:lastColumn="0" w:oddVBand="0" w:evenVBand="0" w:oddHBand="1" w:evenHBand="0" w:firstRowFirstColumn="0" w:firstRowLastColumn="0" w:lastRowFirstColumn="0" w:lastRowLastColumn="0"/>
+            </w:pPr>
+            <w:r>
+              <w:t>Test metrics:</w:t>
+            </w:r>
+          </w:p>
+          <w:p>
+            <w:pPr>
+              <w:cnfStyle w:val="000000100000" w:firstRow="0" w:lastRow="0" w:firstColumn="0" w:lastColumn="0" w:oddVBand="0" w:evenVBand="0" w:oddHBand="1" w:evenHBand="0" w:firstRowFirstColumn="0" w:firstRowLastColumn="0" w:lastRowFirstColumn="0" w:lastRowLastColumn="0"/>
+            </w:pPr>
+            <w:r>
+              <w:t xml:space="preserve"> {'accuracy': 0.5,</w:t>
+            </w:r>
+          </w:p>
+          <w:p>
+            <w:pPr>
+              <w:cnfStyle w:val="000000100000" w:firstRow="0" w:lastRow="0" w:firstColumn="0" w:lastColumn="0" w:oddVBand="0" w:evenVBand="0" w:oddHBand="1" w:evenHBand="0" w:firstRowFirstColumn="0" w:firstRowLastColumn="0" w:lastRowFirstColumn="0" w:lastRowLastColumn="0"/>
+            </w:pPr>
+            <w:r>
+              <w:t>'loss':2.7124898433685303}</w:t>
+            </w:r>
+          </w:p>
+          <w:p>
+            <w:pPr>
+              <w:cnfStyle w:val="000000100000" w:firstRow="0" w:lastRow="0" w:firstColumn="0" w:lastColumn="0" w:oddVBand="0" w:evenVBand="0" w:oddHBand="1" w:evenHBand="0" w:firstRowFirstColumn="0" w:firstRowLastColumn="0" w:lastRowFirstColumn="0" w:lastRowLastColumn="0"/>
+            </w:pPr>
+          </w:p>
+          <w:p>
+            <w:pPr>
+              <w:cnfStyle w:val="000000100000" w:firstRow="0" w:lastRow="0" w:firstColumn="0" w:lastColumn="0" w:oddVBand="0" w:evenVBand="0" w:oddHBand="1" w:evenHBand="0" w:firstRowFirstColumn="0" w:firstRowLastColumn="0" w:lastRowFirstColumn="0" w:lastRowLastColumn="0"/>
+            </w:pPr>
+            <w:r>
+              <w:rPr>
+                <w:rFonts w:ascii="Segoe UI Emoji" w:hAnsi="Segoe UI Emoji" w:cs="Segoe UI Emoji"/>
+              </w:rPr>
+              <w:t>📌</w:t>
+            </w:r>
+            <w:r>
+              <w:t xml:space="preserve"> Threshold metrics @ 0.50</w:t>
+            </w:r>
+          </w:p>
+          <w:p>
+            <w:pPr>
+              <w:cnfStyle w:val="000000100000" w:firstRow="0" w:lastRow="0" w:firstColumn="0" w:lastColumn="0" w:oddVBand="0" w:evenVBand="0" w:oddHBand="1" w:evenHBand="0" w:firstRowFirstColumn="0" w:firstRowLastColumn="0" w:lastRowFirstColumn="0" w:lastRowLastColumn="0"/>
+            </w:pPr>
+            <w:r>
+              <w:t>Confusion Matrix [[TN, FP], [FN, TP]]:</w:t>
+            </w:r>
+          </w:p>
+          <w:p>
+            <w:pPr>
+              <w:cnfStyle w:val="000000100000" w:firstRow="0" w:lastRow="0" w:firstColumn="0" w:lastColumn="0" w:oddVBand="0" w:evenVBand="0" w:oddHBand="1" w:evenHBand="0" w:firstRowFirstColumn="0" w:firstRowLastColumn="0" w:lastRowFirstColumn="0" w:lastRowLastColumn="0"/>
+            </w:pPr>
+            <w:r>
+              <w:t>[[    0 10000]</w:t>
+            </w:r>
+          </w:p>
+          <w:p>
+            <w:pPr>
+              <w:cnfStyle w:val="000000100000" w:firstRow="0" w:lastRow="0" w:firstColumn="0" w:lastColumn="0" w:oddVBand="0" w:evenVBand="0" w:oddHBand="1" w:evenHBand="0" w:firstRowFirstColumn="0" w:firstRowLastColumn="0" w:lastRowFirstColumn="0" w:lastRowLastColumn="0"/>
+            </w:pPr>
+            <w:r>
+              <w:t>[    0 10000]]</w:t>
+            </w:r>
+          </w:p>
+          <w:p>
+            <w:pPr>
+              <w:cnfStyle w:val="000000100000" w:firstRow="0" w:lastRow="0" w:firstColumn="0" w:lastColumn="0" w:oddVBand="0" w:evenVBand="0" w:oddHBand="1" w:evenHBand="0" w:firstRowFirstColumn="0" w:firstRowLastColumn="0" w:lastRowFirstColumn="0" w:lastRowLastColumn="0"/>
+            </w:pPr>
+            <w:r>
+              <w:t xml:space="preserve">Precision: 0.5000 </w:t>
+            </w:r>
+          </w:p>
+          <w:p>
+            <w:pPr>
+              <w:cnfStyle w:val="000000100000" w:firstRow="0" w:lastRow="0" w:firstColumn="0" w:lastColumn="0" w:oddVBand="0" w:evenVBand="0" w:oddHBand="1" w:evenHBand="0" w:firstRowFirstColumn="0" w:firstRowLastColumn="0" w:lastRowFirstColumn="0" w:lastRowLastColumn="0"/>
+            </w:pPr>
+            <w:r>
+              <w:t xml:space="preserve">Recall: 1.0000 </w:t>
+            </w:r>
+          </w:p>
+          <w:p>
+            <w:pPr>
+              <w:cnfStyle w:val="000000100000" w:firstRow="0" w:lastRow="0" w:firstColumn="0" w:lastColumn="0" w:oddVBand="0" w:evenVBand="0" w:oddHBand="1" w:evenHBand="0" w:firstRowFirstColumn="0" w:firstRowLastColumn="0" w:lastRowFirstColumn="0" w:lastRowLastColumn="0"/>
+            </w:pPr>
+            <w:r>
+              <w:t xml:space="preserve">F1: 0.6667 </w:t>
+            </w:r>
+          </w:p>
+          <w:p>
+            <w:pPr>
+              <w:cnfStyle w:val="000000100000" w:firstRow="0" w:lastRow="0" w:firstColumn="0" w:lastColumn="0" w:oddVBand="0" w:evenVBand="0" w:oddHBand="1" w:evenHBand="0" w:firstRowFirstColumn="0" w:firstRowLastColumn="0" w:lastRowFirstColumn="0" w:lastRowLastColumn="0"/>
+            </w:pPr>
+            <w:r>
+              <w:t>Accuracy: 0.5000</w:t>
+            </w:r>
+          </w:p>
+          <w:p>
+            <w:pPr>
+              <w:cnfStyle w:val="000000100000" w:firstRow="0" w:lastRow="0" w:firstColumn="0" w:lastColumn="0" w:oddVBand="0" w:evenVBand="0" w:oddHBand="1" w:evenHBand="0" w:firstRowFirstColumn="0" w:firstRowLastColumn="0" w:lastRowFirstColumn="0" w:lastRowLastColumn="0"/>
+            </w:pPr>
           </w:p>
         </w:tc>
         <w:tc>
@@ -611,18 +752,13 @@
         </w:tc>
       </w:tr>
     </w:tbl>
-    <w:p>
-      <w:pPr>
-        <w:rPr>
-          <w:lang w:val="en-US"/>
-        </w:rPr>
-      </w:pPr>
-    </w:p>
+    <w:p/>
     <w:p>
       <w:pPr>
         <w:pStyle w:val="Heading2"/>
       </w:pPr>
       <w:r>
+        <w:lastRenderedPageBreak/>
         <w:t>AF_V2 - Audio Model Results</w:t>
       </w:r>
     </w:p>
@@ -823,7 +959,7 @@
 </file>
 
 <file path=word/endnotes.xml><?xml version="1.0" encoding="utf-8"?>
-<w:endnotes xmlns:wpc="http://schemas.microsoft.com/office/word/2010/wordprocessingCanvas" xmlns:cx="http://schemas.microsoft.com/office/drawing/2014/chartex" xmlns:cx1="http://schemas.microsoft.com/office/drawing/2015/9/8/chartex" xmlns:cx2="http://schemas.microsoft.com/office/drawing/2015/10/21/chartex" xmlns:cx3="http://schemas.microsoft.com/office/drawing/2016/5/9/chartex" xmlns:cx4="http://schemas.microsoft.com/office/drawing/2016/5/10/chartex" xmlns:cx5="http://schemas.microsoft.com/office/drawing/2016/5/11/chartex" xmlns:cx6="http://schemas.microsoft.com/office/drawing/2016/5/12/chartex" xmlns:cx7="http://schemas.microsoft.com/office/drawing/2016/5/13/chartex" xmlns:cx8="http://schemas.microsoft.com/office/drawing/2016/5/14/chartex" xmlns:mc="http://schemas.openxmlformats.org/markup-compatibility/2006" xmlns:aink="http://schemas.microsoft.com/office/drawing/2016/ink" xmlns:am3d="http://schemas.microsoft.com/office/drawing/2017/model3d" xmlns:o="urn:schemas-microsoft-com:office:office" xmlns:oel="http://schemas.microsoft.com/office/2019/extlst" xmlns:r="http://schemas.openxmlformats.org/officeDocument/2006/relationships" xmlns:m="http://schemas.openxmlformats.org/officeDocument/2006/math" xmlns:v="urn:schemas-microsoft-com:vml" xmlns:wp14="http://schemas.microsoft.com/office/word/2010/wordprocessingDrawing" xmlns:wp="http://schemas.openxmlformats.org/drawingml/2006/wordprocessingDrawing" xmlns:w10="urn:schemas-microsoft-com:office:word" xmlns:w="http://schemas.openxmlformats.org/wordprocessingml/2006/main" xmlns:w14="http://schemas.microsoft.com/office/word/2010/wordml" xmlns:w15="http://schemas.microsoft.com/office/word/2012/wordml" xmlns:w16cex="http://schemas.microsoft.com/office/word/2018/wordml/cex" xmlns:w16cid="http://schemas.microsoft.com/office/word/2016/wordml/cid" xmlns:w16="http://schemas.microsoft.com/office/word/2018/wordml" xmlns:w16sdtdh="http://schemas.microsoft.com/office/word/2020/wordml/sdtdatahash" xmlns:w16se="http://schemas.microsoft.com/office/word/2015/wordml/symex" xmlns:wpg="http://schemas.microsoft.com/office/word/2010/wordprocessingGroup" xmlns:wpi="http://schemas.microsoft.com/office/word/2010/wordprocessingInk" xmlns:wne="http://schemas.microsoft.com/office/word/2006/wordml" xmlns:wps="http://schemas.microsoft.com/office/word/2010/wordprocessingShape" mc:Ignorable="w14 w15 w16se w16cid w16 w16cex w16sdtdh wp14">
+<w:endnotes xmlns:wpc="http://schemas.microsoft.com/office/word/2010/wordprocessingCanvas" xmlns:cx="http://schemas.microsoft.com/office/drawing/2014/chartex" xmlns:cx1="http://schemas.microsoft.com/office/drawing/2015/9/8/chartex" xmlns:cx2="http://schemas.microsoft.com/office/drawing/2015/10/21/chartex" xmlns:cx3="http://schemas.microsoft.com/office/drawing/2016/5/9/chartex" xmlns:cx4="http://schemas.microsoft.com/office/drawing/2016/5/10/chartex" xmlns:cx5="http://schemas.microsoft.com/office/drawing/2016/5/11/chartex" xmlns:cx6="http://schemas.microsoft.com/office/drawing/2016/5/12/chartex" xmlns:cx7="http://schemas.microsoft.com/office/drawing/2016/5/13/chartex" xmlns:cx8="http://schemas.microsoft.com/office/drawing/2016/5/14/chartex" xmlns:mc="http://schemas.openxmlformats.org/markup-compatibility/2006" xmlns:aink="http://schemas.microsoft.com/office/drawing/2016/ink" xmlns:am3d="http://schemas.microsoft.com/office/drawing/2017/model3d" xmlns:o="urn:schemas-microsoft-com:office:office" xmlns:oel="http://schemas.microsoft.com/office/2019/extlst" xmlns:r="http://schemas.openxmlformats.org/officeDocument/2006/relationships" xmlns:m="http://schemas.openxmlformats.org/officeDocument/2006/math" xmlns:v="urn:schemas-microsoft-com:vml" xmlns:wp14="http://schemas.microsoft.com/office/word/2010/wordprocessingDrawing" xmlns:wp="http://schemas.openxmlformats.org/drawingml/2006/wordprocessingDrawing" xmlns:w10="urn:schemas-microsoft-com:office:word" xmlns:w="http://schemas.openxmlformats.org/wordprocessingml/2006/main" xmlns:w14="http://schemas.microsoft.com/office/word/2010/wordml" xmlns:w15="http://schemas.microsoft.com/office/word/2012/wordml" xmlns:w16cex="http://schemas.microsoft.com/office/word/2018/wordml/cex" xmlns:w16cid="http://schemas.microsoft.com/office/word/2016/wordml/cid" xmlns:w16="http://schemas.microsoft.com/office/word/2018/wordml" xmlns:w16du="http://schemas.microsoft.com/office/word/2023/wordml/word16du" xmlns:w16sdtdh="http://schemas.microsoft.com/office/word/2020/wordml/sdtdatahash" xmlns:w16sdtfl="http://schemas.microsoft.com/office/word/2024/wordml/sdtformatlock" xmlns:w16se="http://schemas.microsoft.com/office/word/2015/wordml/symex" xmlns:wpg="http://schemas.microsoft.com/office/word/2010/wordprocessingGroup" xmlns:wpi="http://schemas.microsoft.com/office/word/2010/wordprocessingInk" xmlns:wne="http://schemas.microsoft.com/office/word/2006/wordml" xmlns:wps="http://schemas.microsoft.com/office/word/2010/wordprocessingShape" mc:Ignorable="w14 w15 w16se w16cid w16 w16cex w16sdtdh w16sdtfl w16du wp14">
   <w:endnote w:type="separator" w:id="-1">
     <w:p>
       <w:pPr>
@@ -848,7 +984,7 @@
 </file>
 
 <file path=word/footnotes.xml><?xml version="1.0" encoding="utf-8"?>
-<w:footnotes xmlns:wpc="http://schemas.microsoft.com/office/word/2010/wordprocessingCanvas" xmlns:cx="http://schemas.microsoft.com/office/drawing/2014/chartex" xmlns:cx1="http://schemas.microsoft.com/office/drawing/2015/9/8/chartex" xmlns:cx2="http://schemas.microsoft.com/office/drawing/2015/10/21/chartex" xmlns:cx3="http://schemas.microsoft.com/office/drawing/2016/5/9/chartex" xmlns:cx4="http://schemas.microsoft.com/office/drawing/2016/5/10/chartex" xmlns:cx5="http://schemas.microsoft.com/office/drawing/2016/5/11/chartex" xmlns:cx6="http://schemas.microsoft.com/office/drawing/2016/5/12/chartex" xmlns:cx7="http://schemas.microsoft.com/office/drawing/2016/5/13/chartex" xmlns:cx8="http://schemas.microsoft.com/office/drawing/2016/5/14/chartex" xmlns:mc="http://schemas.openxmlformats.org/markup-compatibility/2006" xmlns:aink="http://schemas.microsoft.com/office/drawing/2016/ink" xmlns:am3d="http://schemas.microsoft.com/office/drawing/2017/model3d" xmlns:o="urn:schemas-microsoft-com:office:office" xmlns:oel="http://schemas.microsoft.com/office/2019/extlst" xmlns:r="http://schemas.openxmlformats.org/officeDocument/2006/relationships" xmlns:m="http://schemas.openxmlformats.org/officeDocument/2006/math" xmlns:v="urn:schemas-microsoft-com:vml" xmlns:wp14="http://schemas.microsoft.com/office/word/2010/wordprocessingDrawing" xmlns:wp="http://schemas.openxmlformats.org/drawingml/2006/wordprocessingDrawing" xmlns:w10="urn:schemas-microsoft-com:office:word" xmlns:w="http://schemas.openxmlformats.org/wordprocessingml/2006/main" xmlns:w14="http://schemas.microsoft.com/office/word/2010/wordml" xmlns:w15="http://schemas.microsoft.com/office/word/2012/wordml" xmlns:w16cex="http://schemas.microsoft.com/office/word/2018/wordml/cex" xmlns:w16cid="http://schemas.microsoft.com/office/word/2016/wordml/cid" xmlns:w16="http://schemas.microsoft.com/office/word/2018/wordml" xmlns:w16sdtdh="http://schemas.microsoft.com/office/word/2020/wordml/sdtdatahash" xmlns:w16se="http://schemas.microsoft.com/office/word/2015/wordml/symex" xmlns:wpg="http://schemas.microsoft.com/office/word/2010/wordprocessingGroup" xmlns:wpi="http://schemas.microsoft.com/office/word/2010/wordprocessingInk" xmlns:wne="http://schemas.microsoft.com/office/word/2006/wordml" xmlns:wps="http://schemas.microsoft.com/office/word/2010/wordprocessingShape" mc:Ignorable="w14 w15 w16se w16cid w16 w16cex w16sdtdh wp14">
+<w:footnotes xmlns:wpc="http://schemas.microsoft.com/office/word/2010/wordprocessingCanvas" xmlns:cx="http://schemas.microsoft.com/office/drawing/2014/chartex" xmlns:cx1="http://schemas.microsoft.com/office/drawing/2015/9/8/chartex" xmlns:cx2="http://schemas.microsoft.com/office/drawing/2015/10/21/chartex" xmlns:cx3="http://schemas.microsoft.com/office/drawing/2016/5/9/chartex" xmlns:cx4="http://schemas.microsoft.com/office/drawing/2016/5/10/chartex" xmlns:cx5="http://schemas.microsoft.com/office/drawing/2016/5/11/chartex" xmlns:cx6="http://schemas.microsoft.com/office/drawing/2016/5/12/chartex" xmlns:cx7="http://schemas.microsoft.com/office/drawing/2016/5/13/chartex" xmlns:cx8="http://schemas.microsoft.com/office/drawing/2016/5/14/chartex" xmlns:mc="http://schemas.openxmlformats.org/markup-compatibility/2006" xmlns:aink="http://schemas.microsoft.com/office/drawing/2016/ink" xmlns:am3d="http://schemas.microsoft.com/office/drawing/2017/model3d" xmlns:o="urn:schemas-microsoft-com:office:office" xmlns:oel="http://schemas.microsoft.com/office/2019/extlst" xmlns:r="http://schemas.openxmlformats.org/officeDocument/2006/relationships" xmlns:m="http://schemas.openxmlformats.org/officeDocument/2006/math" xmlns:v="urn:schemas-microsoft-com:vml" xmlns:wp14="http://schemas.microsoft.com/office/word/2010/wordprocessingDrawing" xmlns:wp="http://schemas.openxmlformats.org/drawingml/2006/wordprocessingDrawing" xmlns:w10="urn:schemas-microsoft-com:office:word" xmlns:w="http://schemas.openxmlformats.org/wordprocessingml/2006/main" xmlns:w14="http://schemas.microsoft.com/office/word/2010/wordml" xmlns:w15="http://schemas.microsoft.com/office/word/2012/wordml" xmlns:w16cex="http://schemas.microsoft.com/office/word/2018/wordml/cex" xmlns:w16cid="http://schemas.microsoft.com/office/word/2016/wordml/cid" xmlns:w16="http://schemas.microsoft.com/office/word/2018/wordml" xmlns:w16du="http://schemas.microsoft.com/office/word/2023/wordml/word16du" xmlns:w16sdtdh="http://schemas.microsoft.com/office/word/2020/wordml/sdtdatahash" xmlns:w16sdtfl="http://schemas.microsoft.com/office/word/2024/wordml/sdtformatlock" xmlns:w16se="http://schemas.microsoft.com/office/word/2015/wordml/symex" xmlns:wpg="http://schemas.microsoft.com/office/word/2010/wordprocessingGroup" xmlns:wpi="http://schemas.microsoft.com/office/word/2010/wordprocessingInk" xmlns:wne="http://schemas.microsoft.com/office/word/2006/wordml" xmlns:wps="http://schemas.microsoft.com/office/word/2010/wordprocessingShape" mc:Ignorable="w14 w15 w16se w16cid w16 w16cex w16sdtdh w16sdtfl w16du wp14">
   <w:footnote w:type="separator" w:id="-1">
     <w:p>
       <w:pPr>
@@ -873,7 +1009,7 @@
 </file>
 
 <file path=word/styles.xml><?xml version="1.0" encoding="utf-8"?>
-<w:styles xmlns:mc="http://schemas.openxmlformats.org/markup-compatibility/2006" xmlns:r="http://schemas.openxmlformats.org/officeDocument/2006/relationships" xmlns:w="http://schemas.openxmlformats.org/wordprocessingml/2006/main" xmlns:w14="http://schemas.microsoft.com/office/word/2010/wordml" xmlns:w15="http://schemas.microsoft.com/office/word/2012/wordml" xmlns:w16cex="http://schemas.microsoft.com/office/word/2018/wordml/cex" xmlns:w16cid="http://schemas.microsoft.com/office/word/2016/wordml/cid" xmlns:w16="http://schemas.microsoft.com/office/word/2018/wordml" xmlns:w16sdtdh="http://schemas.microsoft.com/office/word/2020/wordml/sdtdatahash" xmlns:w16se="http://schemas.microsoft.com/office/word/2015/wordml/symex" mc:Ignorable="w14 w15 w16se w16cid w16 w16cex w16sdtdh">
+<w:styles xmlns:mc="http://schemas.openxmlformats.org/markup-compatibility/2006" xmlns:r="http://schemas.openxmlformats.org/officeDocument/2006/relationships" xmlns:w="http://schemas.openxmlformats.org/wordprocessingml/2006/main" xmlns:w14="http://schemas.microsoft.com/office/word/2010/wordml" xmlns:w15="http://schemas.microsoft.com/office/word/2012/wordml" xmlns:w16cex="http://schemas.microsoft.com/office/word/2018/wordml/cex" xmlns:w16cid="http://schemas.microsoft.com/office/word/2016/wordml/cid" xmlns:w16="http://schemas.microsoft.com/office/word/2018/wordml" xmlns:w16du="http://schemas.microsoft.com/office/word/2023/wordml/word16du" xmlns:w16sdtdh="http://schemas.microsoft.com/office/word/2020/wordml/sdtdatahash" xmlns:w16sdtfl="http://schemas.microsoft.com/office/word/2024/wordml/sdtformatlock" xmlns:w16se="http://schemas.microsoft.com/office/word/2015/wordml/symex" mc:Ignorable="w14 w15 w16se w16cid w16 w16cex w16sdtdh w16sdtfl w16du">
   <w:docDefaults>
     <w:rPrDefault>
       <w:rPr>
@@ -881,7 +1017,7 @@
         <w:kern w:val="2"/>
         <w:sz w:val="24"/>
         <w:szCs w:val="24"/>
-        <w:lang w:eastAsia="en-US" w:bidi="ar-SA"/>
+        <w:lang w:val="en-US" w:eastAsia="en-US" w:bidi="ar-SA"/>
         <w14:ligatures w14:val="standardContextual"/>
       </w:rPr>
     </w:rPrDefault>

</xml_diff>